<commit_message>
image size fixed form 1
</commit_message>
<xml_diff>
--- a/src/lib/engines/docx/templates/Form-I-Template.docx
+++ b/src/lib/engines/docx/templates/Form-I-Template.docx
@@ -73,30 +73,19 @@
             <v:stroke joinstyle="miter"/>
             <v:path gradientshapeok="t" o:connecttype="rect"/>
           </v:shapetype>
-          <v:shape id="_x0000_s1026" type="#_x0000_t202" style="position:absolute;left:0;text-align:left;margin-left:661.85pt;margin-top:2.55pt;width:100pt;height:101.05pt;z-index:251659264;mso-position-horizontal-relative:text;mso-position-vertical-relative:text" o:gfxdata="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" strokeweight=".05pt">
-            <v:textbox>
+          <v:shape id="_x0000_s1026" type="#_x0000_t202" style="position:absolute;left:0;text-align:left;margin-left:661.85pt;margin-top:2.55pt;width:95pt;height:125pt;z-index:251659264;mso-position-horizontal-relative:text;mso-position-vertical-relative:text" o:gfxdata="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" strokeweight="1pt" strokecolor="#000000">
+            <v:textbox inset="2pt,2pt,2pt,2pt">
               <w:txbxContent>
                 <w:p>
                   <w:pPr>
                     <w:pStyle w:val="FrameContents"/>
+                    <w:spacing w:before="0" w:after="0" w:line="240" w:lineRule="auto"/>
+                    <w:ind w:left="0" w:right="0"/>
                     <w:jc w:val="center"/>
-                  </w:pPr>
-                </w:p>
-                <w:p>
-                  <w:pPr>
-                    <w:pStyle w:val="FrameContents"/>
-                    <w:spacing w:after="0" w:line="200" w:lineRule="exact"/>
-                    <w:jc w:val="both"/>
                   </w:pPr>
                   <w:r>
                     <w:t>{%ApplicantPhoto}</w:t>
                   </w:r>
-                </w:p>
-                <w:p>
-                  <w:pPr>
-                    <w:pStyle w:val="FrameContents"/>
-                    <w:jc w:val="center"/>
-                  </w:pPr>
                 </w:p>
               </w:txbxContent>
             </v:textbox>

</xml_diff>

<commit_message>
form 1 edit done
</commit_message>
<xml_diff>
--- a/src/lib/engines/docx/templates/Form-I-Template.docx
+++ b/src/lib/engines/docx/templates/Form-I-Template.docx
@@ -73,14 +73,13 @@
             <v:stroke joinstyle="miter"/>
             <v:path gradientshapeok="t" o:connecttype="rect"/>
           </v:shapetype>
-          <v:shape id="_x0000_s1026" type="#_x0000_t202" style="position:absolute;left:0;text-align:left;margin-left:661.85pt;margin-top:2.55pt;width:95pt;height:125pt;z-index:251659264;mso-position-horizontal-relative:text;mso-position-vertical-relative:text" o:gfxdata="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" strokeweight="1pt" strokecolor="#000000">
+          <v:shape id="_x0000_s1026" type="#_x0000_t202" style="position:absolute;left:0;text-align:left;margin-left:661.85pt;margin-top:2.55pt;width:95pt;height:125pt;z-index:251659264;mso-position-horizontal-relative:text;mso-position-vertical-relative:text" o:gfxdata="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" strokeweight="1pt">
             <v:textbox inset="2pt,2pt,2pt,2pt">
               <w:txbxContent>
                 <w:p>
                   <w:pPr>
                     <w:pStyle w:val="FrameContents"/>
-                    <w:spacing w:before="0" w:after="0" w:line="240" w:lineRule="auto"/>
-                    <w:ind w:left="0" w:right="0"/>
+                    <w:spacing w:after="0" w:line="240" w:lineRule="auto"/>
                     <w:jc w:val="center"/>
                   </w:pPr>
                   <w:r>
@@ -695,7 +694,7 @@
     <w:tbl>
       <w:tblPr>
         <w:tblW w:w="16106" w:type="dxa"/>
-        <w:tblInd w:w="-176" w:type="dxa"/>
+        <w:tblInd w:w="108" w:type="dxa"/>
         <w:tblBorders>
           <w:top w:val="single" w:sz="4" w:space="0" w:color="00000A"/>
           <w:left w:val="single" w:sz="4" w:space="0" w:color="00000A"/>
@@ -2763,12 +2762,9 @@
       </w:r>
       <w:r>
         <w:rPr>
-          <w:rFonts w:ascii="Times New Roman" w:eastAsia="Times New Roman" w:hAnsi="Times New Roman" w:cs="Times New Roman"/>
+          <w:rFonts w:ascii="Times New Roman" w:hAnsi="Times New Roman" w:cs="Times New Roman"/>
           <w:b/>
           <w:bCs/>
-          <w:color w:val="31849B" w:themeColor="accent5" w:themeShade="BF"/>
-          <w:szCs w:val="22"/>
-          <w:lang w:bidi="ar-SA"/>
         </w:rPr>
         <w:t>{CompensationReceived} (Details: {CompensationDetails})</w:t>
       </w:r>
@@ -2808,12 +2804,9 @@
       </w:r>
       <w:r>
         <w:rPr>
-          <w:rFonts w:ascii="Times New Roman" w:eastAsia="Times New Roman" w:hAnsi="Times New Roman" w:cs="Times New Roman"/>
+          <w:rFonts w:ascii="Times New Roman" w:hAnsi="Times New Roman" w:cs="Times New Roman"/>
           <w:b/>
           <w:bCs/>
-          <w:color w:val="FF0000"/>
-          <w:szCs w:val="22"/>
-          <w:lang w:bidi="ar-SA"/>
         </w:rPr>
         <w:t>Bank: {BankName}, Branch: {BranchName}, A/C: {BankAccountNumber}, IFSC: {IFSCCode}</w:t>
       </w:r>
@@ -2857,16 +2850,21 @@
           <w:szCs w:val="22"/>
           <w:lang w:val="en-US" w:bidi="ar-SA"/>
         </w:rPr>
-        <w:t>was included in another employment in ECL?  If so, give details:</w:t>
-      </w:r>
-      <w:r>
-        <w:rPr>
-          <w:rFonts w:ascii="Times New Roman" w:eastAsia="Times New Roman" w:hAnsi="Times New Roman" w:cs="Times New Roman"/>
+        <w:t>was included in another employment in ECL?  If so, give detail</w:t>
+      </w:r>
+      <w:r>
+        <w:rPr>
+          <w:rFonts w:ascii="Times New Roman" w:eastAsia="Times New Roman" w:hAnsi="Times New Roman" w:cs="Times New Roman"/>
+          <w:szCs w:val="22"/>
+          <w:lang w:val="en-US" w:bidi="ar-SA"/>
+        </w:rPr>
+        <w:t>s:</w:t>
+      </w:r>
+      <w:r>
+        <w:rPr>
+          <w:rFonts w:ascii="Times New Roman" w:hAnsi="Times New Roman" w:cs="Times New Roman"/>
           <w:b/>
           <w:bCs/>
-          <w:color w:val="FF0000"/>
-          <w:szCs w:val="22"/>
-          <w:lang w:bidi="ar-SA"/>
         </w:rPr>
         <w:t>{PreviousEmploymentClaim} (Details: {EmploymentClaimDetails})</w:t>
       </w:r>
@@ -2909,12 +2907,9 @@
       </w:r>
       <w:r>
         <w:rPr>
-          <w:rFonts w:ascii="Times New Roman" w:eastAsia="Times New Roman" w:hAnsi="Times New Roman" w:cs="Times New Roman"/>
+          <w:rFonts w:ascii="Times New Roman" w:hAnsi="Times New Roman" w:cs="Times New Roman"/>
           <w:b/>
           <w:bCs/>
-          <w:color w:val="FF0000"/>
-          <w:szCs w:val="22"/>
-          <w:lang w:bidi="ar-SA"/>
         </w:rPr>
         <w:t xml:space="preserve">{LandDisputeStatus} (Details: {DisputeDetails}) </w:t>
       </w:r>
@@ -2953,7 +2948,23 @@
           <w:szCs w:val="22"/>
           <w:lang w:val="en-US" w:bidi="ar-SA"/>
         </w:rPr>
-        <w:t>Whether these plots/lands are presently free from any encumbrances? If not, give details:</w:t>
+        <w:t>Whether these plots/lands are presently free from any encumbrances? If not, give detail</w:t>
+      </w:r>
+      <w:r>
+        <w:rPr>
+          <w:rFonts w:ascii="Times New Roman" w:eastAsia="Times New Roman" w:hAnsi="Times New Roman" w:cs="Times New Roman"/>
+          <w:szCs w:val="22"/>
+          <w:lang w:val="en-US" w:bidi="ar-SA"/>
+        </w:rPr>
+        <w:t>s:</w:t>
+      </w:r>
+      <w:r>
+        <w:rPr>
+          <w:rFonts w:ascii="Times New Roman" w:hAnsi="Times New Roman" w:cs="Times New Roman"/>
+          <w:b/>
+          <w:bCs/>
+        </w:rPr>
+        <w:t>{EncumbranceFree} (Details: {EncumbranceDetails})</w:t>
       </w:r>
       <w:r>
         <w:rPr>
@@ -2964,7 +2975,7 @@
           <w:szCs w:val="22"/>
           <w:lang w:bidi="ar-SA"/>
         </w:rPr>
-        <w:t xml:space="preserve">{EncumbranceFree} (Details: {EncumbranceDetails}) </w:t>
+        <w:t xml:space="preserve"> </w:t>
       </w:r>
     </w:p>
     <w:p>
@@ -3015,11 +3026,18 @@
       </w:r>
       <w:r>
         <w:rPr>
-          <w:rFonts w:ascii="Times New Roman" w:eastAsia="Times New Roman" w:hAnsi="Times New Roman" w:cs="Times New Roman"/>
-          <w:szCs w:val="22"/>
-          <w:lang w:val="en-US" w:bidi="ar-SA"/>
+          <w:rFonts w:ascii="Times New Roman" w:hAnsi="Times New Roman" w:cs="Times New Roman"/>
+          <w:szCs w:val="22"/>
         </w:rPr>
         <w:t>:</w:t>
+      </w:r>
+      <w:r>
+        <w:rPr>
+          <w:rFonts w:ascii="Times New Roman" w:hAnsi="Times New Roman" w:cs="Times New Roman"/>
+          <w:b/>
+          <w:bCs/>
+        </w:rPr>
+        <w:t>{PeacefulPossession} (Details: {PossessionRemarks})</w:t>
       </w:r>
       <w:r>
         <w:rPr>
@@ -3030,7 +3048,7 @@
           <w:szCs w:val="22"/>
           <w:lang w:bidi="ar-SA"/>
         </w:rPr>
-        <w:t xml:space="preserve">{PeacefulPossession} (Details: {PossessionRemarks}) </w:t>
+        <w:t xml:space="preserve"> </w:t>
       </w:r>
     </w:p>
     <w:p>
@@ -3071,6 +3089,14 @@
       </w:r>
       <w:r>
         <w:rPr>
+          <w:rFonts w:ascii="Times New Roman" w:hAnsi="Times New Roman" w:cs="Times New Roman"/>
+          <w:b/>
+          <w:bCs/>
+        </w:rPr>
+        <w:t>{OneTimeCompensationAccepted} (Details: {CompensationRemarks})</w:t>
+      </w:r>
+      <w:r>
+        <w:rPr>
           <w:rFonts w:ascii="Times New Roman" w:eastAsia="Times New Roman" w:hAnsi="Times New Roman" w:cs="Times New Roman"/>
           <w:b/>
           <w:bCs/>
@@ -3078,7 +3104,7 @@
           <w:szCs w:val="22"/>
           <w:lang w:bidi="ar-SA"/>
         </w:rPr>
-        <w:t xml:space="preserve">{OneTimeCompensationAccepted} (Details: {CompensationRemarks}) </w:t>
+        <w:t xml:space="preserve"> </w:t>
       </w:r>
       <w:bookmarkStart w:id="0" w:name="_GoBack"/>
       <w:bookmarkEnd w:id="0"/>
@@ -3225,7 +3251,7 @@
     </w:p>
     <w:sectPr>
       <w:pgSz w:w="16838" w:h="11906" w:orient="landscape"/>
-      <w:pgMar w:top="810" w:right="720" w:bottom="450" w:left="720" w:header="0" w:footer="0" w:gutter="0"/>
+      <w:pgMar w:top="810" w:right="720" w:bottom="450" w:left="567" w:header="0" w:footer="0" w:gutter="0"/>
       <w:cols w:space="720"/>
       <w:formProt w:val="0"/>
       <w:docGrid w:linePitch="360" w:charSpace="4096"/>
@@ -3402,7 +3428,7 @@
   <w:abstractNum w:abstractNumId="1">
     <w:nsid w:val="611114D5"/>
     <w:multiLevelType w:val="multilevel"/>
-    <w:tmpl w:val="611114D5"/>
+    <w:tmpl w:val="D92C077C"/>
     <w:lvl w:ilvl="0">
       <w:start w:val="9"/>
       <w:numFmt w:val="decimal"/>
@@ -3411,6 +3437,10 @@
       <w:pPr>
         <w:ind w:left="720" w:hanging="360"/>
       </w:pPr>
+      <w:rPr>
+        <w:b w:val="0"/>
+        <w:color w:val="000000" w:themeColor="text1"/>
+      </w:rPr>
     </w:lvl>
     <w:lvl w:ilvl="1">
       <w:start w:val="1"/>

</xml_diff>